<commit_message>
spec: event-type picker all-live correction + per-religion items (0043/0023 + DECISION_LOG)
Owner instruction 2026-06-04 ("check cowork; if not done, do it yourself").
Cowork's batch corrected 0000's picker (committed in e6b9269) but had not done
the rest. Applied directly:
- DECISION_LOG: "keep everything live" decision row (all 9 event types + all 6
  wedding religions stay live; code not re-gated).
- 0043_wedding_type_picker: `chinese` in Axis A + a "Per-religion updates"
  section (Chinese active #885/#889, vendor-readiness gate #895, traditions
  guide #890/#898).
- 0023_admin_console: Wedding types (#895) + Wedding traditions (#898) Directory
  surfaces + surface count 29 → 31.
- .docx mirrors regenerated for 0023 + 0043 (0000 already current).

Co-Authored-By: Claude Opus 4.8 <noreply@anthropic.com>
</commit_message>
<xml_diff>
--- a/0023_admin_console/0023_admin_console.docx
+++ b/0023_admin_console/0023_admin_console.docx
@@ -2,7 +2,7 @@
 <file path=word/document.xml><?xml version="1.0" encoding="utf-8"?>
 <w:document xmlns:w="http://schemas.openxmlformats.org/wordprocessingml/2006/main" xmlns:m="http://schemas.openxmlformats.org/officeDocument/2006/math" xmlns:r="http://schemas.openxmlformats.org/officeDocument/2006/relationships" xmlns:o="urn:schemas-microsoft-com:office:office" xmlns:v="urn:schemas-microsoft-com:vml" xmlns:w10="urn:schemas-microsoft-com:office:word" xmlns:a="http://schemas.openxmlformats.org/drawingml/2006/main" xmlns:pic="http://schemas.openxmlformats.org/drawingml/2006/picture" xmlns:wp="http://schemas.openxmlformats.org/drawingml/2006/wordprocessingDrawing">
   <w:body>
-    <w:bookmarkStart w:id="75" w:name="Xc83ac237fa79d49c1a9bc1d2ae29769edfb8f49"/>
+    <w:bookmarkStart w:id="76" w:name="Xc83ac237fa79d49c1a9bc1d2ae29769edfb8f49"/>
     <w:p>
       <w:pPr>
         <w:pStyle w:val="Heading1"/>
@@ -104,13 +104,13 @@
         </w:pict>
       </w:r>
     </w:p>
-    <w:bookmarkStart w:id="13" w:name="the-29-admin-surfaces"/>
+    <w:bookmarkStart w:id="14" w:name="the-31-admin-surfaces"/>
     <w:p>
       <w:pPr>
         <w:pStyle w:val="Heading2"/>
       </w:pPr>
       <w:r>
-        <w:t xml:space="preserve">1. The 29 admin surfaces</w:t>
+        <w:t xml:space="preserve">1. The 31 admin surfaces</w:t>
       </w:r>
     </w:p>
     <w:p>
@@ -1093,6 +1093,278 @@
               <w:pStyle w:val="Compact"/>
             </w:pPr>
             <w:r>
+              <w:t xml:space="preserve">30</w:t>
+            </w:r>
+          </w:p>
+        </w:tc>
+        <w:tc>
+          <w:tcPr/>
+          <w:p>
+            <w:pPr>
+              <w:pStyle w:val="Compact"/>
+            </w:pPr>
+            <w:r>
+              <w:rPr>
+                <w:b/>
+                <w:bCs/>
+              </w:rPr>
+              <w:t xml:space="preserve">Wedding types</w:t>
+            </w:r>
+          </w:p>
+        </w:tc>
+        <w:tc>
+          <w:tcPr/>
+          <w:p>
+            <w:pPr>
+              <w:pStyle w:val="Compact"/>
+            </w:pPr>
+            <w:r>
+              <w:rPr>
+                <w:rStyle w:val="VerbatimChar"/>
+              </w:rPr>
+              <w:t xml:space="preserve">/admin/wedding-types</w:t>
+            </w:r>
+          </w:p>
+        </w:tc>
+        <w:tc>
+          <w:tcPr/>
+          <w:p>
+            <w:pPr>
+              <w:pStyle w:val="Compact"/>
+            </w:pPr>
+            <w:r>
+              <w:t xml:space="preserve">🆕 SHIPPED 2026-06-03 (#895). Per-religion launch gate (</w:t>
+            </w:r>
+            <w:hyperlink r:id="rId10">
+              <w:r>
+                <w:rPr>
+                  <w:rStyle w:val="Hyperlink"/>
+                </w:rPr>
+                <w:t xml:space="preserve">0043</w:t>
+              </w:r>
+            </w:hyperlink>
+            <w:r>
+              <w:t xml:space="preserve">) — readiness counts (compatible vendors + ceremonial venues per</w:t>
+            </w:r>
+            <w:r>
+              <w:t xml:space="preserve"> </w:t>
+            </w:r>
+            <w:r>
+              <w:rPr>
+                <w:rStyle w:val="VerbatimChar"/>
+              </w:rPr>
+              <w:t xml:space="preserve">ceremony_type</w:t>
+            </w:r>
+            <w:r>
+              <w:t xml:space="preserve">, from</w:t>
+            </w:r>
+            <w:r>
+              <w:t xml:space="preserve"> </w:t>
+            </w:r>
+            <w:r>
+              <w:rPr>
+                <w:rStyle w:val="VerbatimChar"/>
+              </w:rPr>
+              <w:t xml:space="preserve">compatible_ceremony_types[]</w:t>
+            </w:r>
+            <w:r>
+              <w:t xml:space="preserve">) vs an editable threshold ·</w:t>
+            </w:r>
+            <w:r>
+              <w:t xml:space="preserve"> </w:t>
+            </w:r>
+            <w:r>
+              <w:rPr>
+                <w:b/>
+                <w:bCs/>
+              </w:rPr>
+              <w:t xml:space="preserve">Open / Hold (coming-soon) / Disable</w:t>
+            </w:r>
+            <w:r>
+              <w:t xml:space="preserve">. Flipping a religion greys it (non-selectable) in BOTH the onboarding faith picker and the create-event picker. Writes</w:t>
+            </w:r>
+            <w:r>
+              <w:t xml:space="preserve"> </w:t>
+            </w:r>
+            <w:r>
+              <w:rPr>
+                <w:rStyle w:val="VerbatimChar"/>
+              </w:rPr>
+              <w:t xml:space="preserve">wedding_type_launch_status</w:t>
+            </w:r>
+            <w:r>
+              <w:t xml:space="preserve">.</w:t>
+            </w:r>
+          </w:p>
+        </w:tc>
+      </w:tr>
+      <w:tr>
+        <w:tc>
+          <w:tcPr/>
+          <w:p>
+            <w:pPr>
+              <w:pStyle w:val="Compact"/>
+            </w:pPr>
+            <w:r>
+              <w:t xml:space="preserve">Directory</w:t>
+            </w:r>
+          </w:p>
+        </w:tc>
+        <w:tc>
+          <w:tcPr/>
+          <w:p>
+            <w:pPr>
+              <w:pStyle w:val="Compact"/>
+            </w:pPr>
+            <w:r>
+              <w:t xml:space="preserve">31</w:t>
+            </w:r>
+          </w:p>
+        </w:tc>
+        <w:tc>
+          <w:tcPr/>
+          <w:p>
+            <w:pPr>
+              <w:pStyle w:val="Compact"/>
+            </w:pPr>
+            <w:r>
+              <w:rPr>
+                <w:b/>
+                <w:bCs/>
+              </w:rPr>
+              <w:t xml:space="preserve">Wedding traditions</w:t>
+            </w:r>
+          </w:p>
+        </w:tc>
+        <w:tc>
+          <w:tcPr/>
+          <w:p>
+            <w:pPr>
+              <w:pStyle w:val="Compact"/>
+            </w:pPr>
+            <w:r>
+              <w:rPr>
+                <w:rStyle w:val="VerbatimChar"/>
+              </w:rPr>
+              <w:t xml:space="preserve">/admin/wedding-traditions</w:t>
+            </w:r>
+          </w:p>
+        </w:tc>
+        <w:tc>
+          <w:tcPr/>
+          <w:p>
+            <w:pPr>
+              <w:pStyle w:val="Compact"/>
+            </w:pPr>
+            <w:r>
+              <w:t xml:space="preserve">🆕 SHIPPED 2026-06-03 (#898). Per-religion</w:t>
+            </w:r>
+            <w:r>
+              <w:t xml:space="preserve"> </w:t>
+            </w:r>
+            <w:r>
+              <w:t xml:space="preserve">“What to expect”</w:t>
+            </w:r>
+            <w:r>
+              <w:t xml:space="preserve"> </w:t>
+            </w:r>
+            <w:r>
+              <w:t xml:space="preserve">content editor (</w:t>
+            </w:r>
+            <w:hyperlink r:id="rId10">
+              <w:r>
+                <w:rPr>
+                  <w:rStyle w:val="Hyperlink"/>
+                </w:rPr>
+                <w:t xml:space="preserve">0043</w:t>
+              </w:r>
+            </w:hyperlink>
+            <w:r>
+              <w:t xml:space="preserve">) — edit / add / remove / reorder the traditions items shown on each couple’s</w:t>
+            </w:r>
+            <w:r>
+              <w:t xml:space="preserve"> </w:t>
+            </w:r>
+            <w:r>
+              <w:rPr>
+                <w:rStyle w:val="VerbatimChar"/>
+              </w:rPr>
+              <w:t xml:space="preserve">/paperwork</w:t>
+            </w:r>
+            <w:r>
+              <w:t xml:space="preserve"> </w:t>
+            </w:r>
+            <w:r>
+              <w:t xml:space="preserve">guide ·</w:t>
+            </w:r>
+            <w:r>
+              <w:t xml:space="preserve"> </w:t>
+            </w:r>
+            <w:r>
+              <w:rPr>
+                <w:b/>
+                <w:bCs/>
+              </w:rPr>
+              <w:t xml:space="preserve">Load starter content</w:t>
+            </w:r>
+            <w:r>
+              <w:t xml:space="preserve"> </w:t>
+            </w:r>
+            <w:r>
+              <w:t xml:space="preserve">copies the code defaults · drives the</w:t>
+            </w:r>
+            <w:r>
+              <w:t xml:space="preserve"> </w:t>
+            </w:r>
+            <w:r>
+              <w:rPr>
+                <w:rStyle w:val="VerbatimChar"/>
+              </w:rPr>
+              <w:t xml:space="preserve">wedding_tradition_items</w:t>
+            </w:r>
+            <w:r>
+              <w:t xml:space="preserve"> </w:t>
+            </w:r>
+            <w:r>
+              <w:t xml:space="preserve">table (code</w:t>
+            </w:r>
+            <w:r>
+              <w:t xml:space="preserve"> </w:t>
+            </w:r>
+            <w:r>
+              <w:rPr>
+                <w:rStyle w:val="VerbatimChar"/>
+              </w:rPr>
+              <w:t xml:space="preserve">lib/wedding-traditions.ts</w:t>
+            </w:r>
+            <w:r>
+              <w:t xml:space="preserve"> </w:t>
+            </w:r>
+            <w:r>
+              <w:t xml:space="preserve">is the fallback + seed source).</w:t>
+            </w:r>
+          </w:p>
+        </w:tc>
+      </w:tr>
+      <w:tr>
+        <w:tc>
+          <w:tcPr/>
+          <w:p>
+            <w:pPr>
+              <w:pStyle w:val="Compact"/>
+            </w:pPr>
+            <w:r>
+              <w:t xml:space="preserve">Directory</w:t>
+            </w:r>
+          </w:p>
+        </w:tc>
+        <w:tc>
+          <w:tcPr/>
+          <w:p>
+            <w:pPr>
+              <w:pStyle w:val="Compact"/>
+            </w:pPr>
+            <w:r>
               <w:t xml:space="preserve">13</w:t>
             </w:r>
           </w:p>
@@ -1716,7 +1988,7 @@
             <w:r>
               <w:t xml:space="preserve"> </w:t>
             </w:r>
-            <w:hyperlink r:id="rId10">
+            <w:hyperlink r:id="rId11">
               <w:r>
                 <w:rPr>
                   <w:rStyle w:val="Hyperlink"/>
@@ -2665,7 +2937,7 @@
       <w:r>
         <w:t xml:space="preserve"> </w:t>
       </w:r>
-      <w:hyperlink r:id="rId11">
+      <w:hyperlink r:id="rId12">
         <w:r>
           <w:rPr>
             <w:rStyle w:val="Hyperlink"/>
@@ -2682,7 +2954,7 @@
       <w:r>
         <w:t xml:space="preserve"> </w:t>
       </w:r>
-      <w:hyperlink r:id="rId12">
+      <w:hyperlink r:id="rId13">
         <w:r>
           <w:rPr>
             <w:rStyle w:val="Hyperlink"/>
@@ -2716,8 +2988,8 @@
         </w:pict>
       </w:r>
     </w:p>
-    <w:bookmarkEnd w:id="13"/>
-    <w:bookmarkStart w:id="14" w:name="X3287cb32d8e8918b7fc54714ce038e693274466"/>
+    <w:bookmarkEnd w:id="14"/>
+    <w:bookmarkStart w:id="15" w:name="X3287cb32d8e8918b7fc54714ce038e693274466"/>
     <w:p>
       <w:pPr>
         <w:pStyle w:val="Heading2"/>
@@ -2889,8 +3161,8 @@
         </w:pict>
       </w:r>
     </w:p>
-    <w:bookmarkEnd w:id="14"/>
-    <w:bookmarkStart w:id="64" w:name="per-surface-mechanics"/>
+    <w:bookmarkEnd w:id="15"/>
+    <w:bookmarkStart w:id="65" w:name="per-surface-mechanics"/>
     <w:p>
       <w:pPr>
         <w:pStyle w:val="Heading2"/>
@@ -2899,7 +3171,7 @@
         <w:t xml:space="preserve">3. Per-surface mechanics</w:t>
       </w:r>
     </w:p>
-    <w:bookmarkStart w:id="15" w:name="home-queue-overview"/>
+    <w:bookmarkStart w:id="16" w:name="home-queue-overview"/>
     <w:p>
       <w:pPr>
         <w:pStyle w:val="Heading3"/>
@@ -3056,8 +3328,8 @@
         <w:t xml:space="preserve">Below: recent admin activity feed (other admins’ actions), platform metrics (DAU, conversion, payments processed today).</w:t>
       </w:r>
     </w:p>
-    <w:bookmarkEnd w:id="15"/>
-    <w:bookmarkStart w:id="16" w:name="verification-queues"/>
+    <w:bookmarkEnd w:id="16"/>
+    <w:bookmarkStart w:id="17" w:name="verification-queues"/>
     <w:p>
       <w:pPr>
         <w:pStyle w:val="Heading3"/>
@@ -3656,8 +3928,8 @@
         <w:t xml:space="preserve">Each queue item has standard actions: Approve · Reject · Request more info · Flag for senior admin.</w:t>
       </w:r>
     </w:p>
-    <w:bookmarkEnd w:id="16"/>
-    <w:bookmarkStart w:id="17" w:name="payments-activations"/>
+    <w:bookmarkEnd w:id="17"/>
+    <w:bookmarkStart w:id="18" w:name="payments-activations"/>
     <w:p>
       <w:pPr>
         <w:pStyle w:val="Heading3"/>
@@ -3947,8 +4219,8 @@
         <w:t xml:space="preserve">“this is the vendor buying their own product, not a customer purchase.”</w:t>
       </w:r>
     </w:p>
-    <w:bookmarkEnd w:id="17"/>
-    <w:bookmarkStart w:id="18" w:name="users"/>
+    <w:bookmarkEnd w:id="18"/>
+    <w:bookmarkStart w:id="19" w:name="users"/>
     <w:p>
       <w:pPr>
         <w:pStyle w:val="Heading3"/>
@@ -5239,8 +5511,8 @@
         <w:t xml:space="preserve">column stays on the schema for now (deprecated; drop in a future migration once the audit window has passed).</w:t>
       </w:r>
     </w:p>
-    <w:bookmarkEnd w:id="18"/>
-    <w:bookmarkStart w:id="19" w:name="pricing-catalog"/>
+    <w:bookmarkEnd w:id="19"/>
+    <w:bookmarkStart w:id="20" w:name="pricing-catalog"/>
     <w:p>
       <w:pPr>
         <w:pStyle w:val="Heading3"/>
@@ -6749,8 +7021,8 @@
         <w:t xml:space="preserve">E.g., LAUNCH50 = 50% off Papic 5-seat for the first 100 redemptions, expires 2026-12-31.</w:t>
       </w:r>
     </w:p>
-    <w:bookmarkEnd w:id="19"/>
-    <w:bookmarkStart w:id="20" w:name="X629d01d941ffb7283460480520ac7430455fa9c"/>
+    <w:bookmarkEnd w:id="20"/>
+    <w:bookmarkStart w:id="21" w:name="X629d01d941ffb7283460480520ac7430455fa9c"/>
     <w:p>
       <w:pPr>
         <w:pStyle w:val="Heading3"/>
@@ -9262,8 +9534,8 @@
         <w:t xml:space="preserve">CHECK constraint enforces the mutual exclusivity locked in § 10a + § 10b — owners can never accidentally be flagged as team-pool eligible (which would create double-comping ambiguity).</w:t>
       </w:r>
     </w:p>
-    <w:bookmarkEnd w:id="20"/>
-    <w:bookmarkStart w:id="21" w:name="X62d13111ffeb67bac72323e8c803b2424f056e6"/>
+    <w:bookmarkEnd w:id="21"/>
+    <w:bookmarkStart w:id="22" w:name="X62d13111ffeb67bac72323e8c803b2424f056e6"/>
     <w:p>
       <w:pPr>
         <w:pStyle w:val="Heading3"/>
@@ -10239,8 +10511,8 @@
         <w:t xml:space="preserve">changing the receiving account numbers is the single highest-leverage fraud vector in the V1 payment system. If a compromised admin account silently swaps the BDO account number for an attacker-controlled one, every customer payment for 24 hours could route to the attacker. Two-admin approval makes this attack require simultaneous compromise of two admins, which is dramatically harder. The 24-hour reconciliation SLA means the attack window is bounded even if both admins are compromised — finance sees the diversion the next day.</w:t>
       </w:r>
     </w:p>
-    <w:bookmarkEnd w:id="21"/>
-    <w:bookmarkStart w:id="22" w:name="X993371b02f222a109786e8c79afe7766fce93b6"/>
+    <w:bookmarkEnd w:id="22"/>
+    <w:bookmarkStart w:id="23" w:name="X993371b02f222a109786e8c79afe7766fce93b6"/>
     <w:p>
       <w:pPr>
         <w:pStyle w:val="Heading3"/>
@@ -11233,8 +11505,8 @@
         <w:t xml:space="preserve">) or to align with renegotiated gateway contracts. Changes ripple to the customer-facing checkout fee calculator (0034 § Setnayan Pay) within 1 minute via cache TTL.</w:t>
       </w:r>
     </w:p>
-    <w:bookmarkEnd w:id="22"/>
-    <w:bookmarkStart w:id="23" w:name="Xe9854108212c086270d35a62e476819f4ef86f0"/>
+    <w:bookmarkEnd w:id="23"/>
+    <w:bookmarkStart w:id="24" w:name="Xe9854108212c086270d35a62e476819f4ef86f0"/>
     <w:p>
       <w:pPr>
         <w:pStyle w:val="Heading3"/>
@@ -11644,8 +11916,8 @@
         <w:t xml:space="preserve">);</w:t>
       </w:r>
     </w:p>
-    <w:bookmarkEnd w:id="23"/>
-    <w:bookmarkStart w:id="25" w:name="X2ed130420e47bed43fb955e334b9d6bc04e4b83"/>
+    <w:bookmarkEnd w:id="24"/>
+    <w:bookmarkStart w:id="26" w:name="X2ed130420e47bed43fb955e334b9d6bc04e4b83"/>
     <w:p>
       <w:pPr>
         <w:pStyle w:val="Heading3"/>
@@ -11788,7 +12060,7 @@
       <w:r>
         <w:t xml:space="preserve"> </w:t>
       </w:r>
-      <w:hyperlink r:id="rId24">
+      <w:hyperlink r:id="rId25">
         <w:r>
           <w:rPr>
             <w:rStyle w:val="Hyperlink"/>
@@ -12962,8 +13234,8 @@
         <w:t xml:space="preserve">schema lands in V1 (matrix is sparse — only BDO QR, GCash QR, and bank-transfer-manual are populated). When Maya Business is approved at V1.5+, the matrix expands automatically as the new method rows insert via § 3.5d migration. No code change needed to onboard new methods; the admin just flips toggles on the new rows.</w:t>
       </w:r>
     </w:p>
-    <w:bookmarkEnd w:id="25"/>
-    <w:bookmarkStart w:id="26" w:name="disputes-refunds"/>
+    <w:bookmarkEnd w:id="26"/>
+    <w:bookmarkStart w:id="27" w:name="disputes-refunds"/>
     <w:p>
       <w:pPr>
         <w:pStyle w:val="Heading3"/>
@@ -13183,8 +13455,8 @@
         <w:t xml:space="preserve">. High-value disputes (&gt; ₱20,000 refund) require two-admin approval.</w:t>
       </w:r>
     </w:p>
-    <w:bookmarkEnd w:id="26"/>
-    <w:bookmarkStart w:id="27" w:name="Xd7c336140f865377312ec7bbd876077fcae07d9"/>
+    <w:bookmarkEnd w:id="27"/>
+    <w:bookmarkStart w:id="28" w:name="Xd7c336140f865377312ec7bbd876077fcae07d9"/>
     <w:p>
       <w:pPr>
         <w:pStyle w:val="Heading3"/>
@@ -13287,8 +13559,8 @@
         <w:t xml:space="preserve">All decisions logged with admin attribution. Refunds &gt; ₱25K still require two-admin approval per § 9.1.</w:t>
       </w:r>
     </w:p>
-    <w:bookmarkEnd w:id="27"/>
-    <w:bookmarkStart w:id="28" w:name="settings"/>
+    <w:bookmarkEnd w:id="28"/>
+    <w:bookmarkStart w:id="29" w:name="settings"/>
     <w:p>
       <w:pPr>
         <w:pStyle w:val="Heading3"/>
@@ -13539,8 +13811,8 @@
         <w:t xml:space="preserve">for compliance / post-incident review</w:t>
       </w:r>
     </w:p>
-    <w:bookmarkEnd w:id="28"/>
-    <w:bookmarkStart w:id="29" w:name="funnel-analytics-new-2026-05-12"/>
+    <w:bookmarkEnd w:id="29"/>
+    <w:bookmarkStart w:id="30" w:name="funnel-analytics-new-2026-05-12"/>
     <w:p>
       <w:pPr>
         <w:pStyle w:val="Heading3"/>
@@ -14334,8 +14606,8 @@
         <w:t xml:space="preserve">; etc. Spec each iteration’s funnel-event emissions in its own .md doc when next touched.</w:t>
       </w:r>
     </w:p>
-    <w:bookmarkEnd w:id="29"/>
-    <w:bookmarkStart w:id="30" w:name="X35c3f4e33a0e275681f3aaa541c34d9d09ef9c4"/>
+    <w:bookmarkEnd w:id="30"/>
+    <w:bookmarkStart w:id="31" w:name="X35c3f4e33a0e275681f3aaa541c34d9d09ef9c4"/>
     <w:p>
       <w:pPr>
         <w:pStyle w:val="Heading3"/>
@@ -15920,8 +16192,8 @@
         </w:pict>
       </w:r>
     </w:p>
-    <w:bookmarkEnd w:id="30"/>
-    <w:bookmarkStart w:id="31" w:name="website-editor-locked-2026-05-15"/>
+    <w:bookmarkEnd w:id="31"/>
+    <w:bookmarkStart w:id="32" w:name="website-editor-locked-2026-05-15"/>
     <w:p>
       <w:pPr>
         <w:pStyle w:val="Heading3"/>
@@ -16347,8 +16619,8 @@
         </w:pict>
       </w:r>
     </w:p>
-    <w:bookmarkEnd w:id="31"/>
-    <w:bookmarkStart w:id="38" w:name="Xfa425620ba31ba0212d6c7de11585cc49d489b9"/>
+    <w:bookmarkEnd w:id="32"/>
+    <w:bookmarkStart w:id="39" w:name="Xfa425620ba31ba0212d6c7de11585cc49d489b9"/>
     <w:p>
       <w:pPr>
         <w:pStyle w:val="Heading3"/>
@@ -16399,7 +16671,7 @@
         <w:t xml:space="preserve">single-admin per § 4.3 (review decisions are reversible — admin can lift enforcement via the appeal flow without two-admin approval).</w:t>
       </w:r>
     </w:p>
-    <w:bookmarkStart w:id="32" w:name="queue-view-default"/>
+    <w:bookmarkStart w:id="33" w:name="queue-view-default"/>
     <w:p>
       <w:pPr>
         <w:pStyle w:val="Heading4"/>
@@ -17001,8 +17273,8 @@
         </w:tc>
       </w:tr>
     </w:tbl>
-    <w:bookmarkEnd w:id="32"/>
-    <w:bookmarkStart w:id="33" w:name="per-match-comparison-panel-drilldown"/>
+    <w:bookmarkEnd w:id="33"/>
+    <w:bookmarkStart w:id="34" w:name="per-match-comparison-panel-drilldown"/>
     <w:p>
       <w:pPr>
         <w:pStyle w:val="Heading4"/>
@@ -17019,8 +17291,8 @@
         <w:t xml:space="preserve">Clicking a row expands into a side-by-side comparison of the flagged account’s event vs each matched trial-used account’s event. Three columns: signal type / flagged-account value / matched-account value, with the matching signals highlighted. Admin can scan and decide: is this the same person on a new account (abuse) or a different couple at the same venue/date (false positive — common for popular Tagaytay venues on Saturday afternoons).</w:t>
       </w:r>
     </w:p>
-    <w:bookmarkEnd w:id="33"/>
-    <w:bookmarkStart w:id="34" w:name="admin-actions"/>
+    <w:bookmarkEnd w:id="34"/>
+    <w:bookmarkStart w:id="35" w:name="admin-actions"/>
     <w:p>
       <w:pPr>
         <w:pStyle w:val="Heading4"/>
@@ -17450,8 +17722,8 @@
         <w:t xml:space="preserve">(the trial-start UI shows the under-review modal).</w:t>
       </w:r>
     </w:p>
-    <w:bookmarkEnd w:id="34"/>
-    <w:bookmarkStart w:id="35" w:name="appeal-driven-enforcement-reversal"/>
+    <w:bookmarkEnd w:id="35"/>
+    <w:bookmarkStart w:id="36" w:name="appeal-driven-enforcement-reversal"/>
     <w:p>
       <w:pPr>
         <w:pStyle w:val="Heading4"/>
@@ -17619,8 +17891,8 @@
         <w:t xml:space="preserve">“Your appeal was reviewed and your Setnayan Concierge access has been restored. Reason: {admin_notes}.”</w:t>
       </w:r>
     </w:p>
-    <w:bookmarkEnd w:id="35"/>
-    <w:bookmarkStart w:id="36" w:name="mobile"/>
+    <w:bookmarkEnd w:id="36"/>
+    <w:bookmarkStart w:id="37" w:name="mobile"/>
     <w:p>
       <w:pPr>
         <w:pStyle w:val="Heading4"/>
@@ -17655,8 +17927,8 @@
         <w:t xml:space="preserve">opens the per-match comparison panel as a full-screen sheet with the Clear / Confirm / Defer actions at the bottom.</w:t>
       </w:r>
     </w:p>
-    <w:bookmarkEnd w:id="36"/>
-    <w:bookmarkStart w:id="37" w:name="X55f09cbb45585140ceeb8288a987485c4695ce1"/>
+    <w:bookmarkEnd w:id="37"/>
+    <w:bookmarkStart w:id="38" w:name="X55f09cbb45585140ceeb8288a987485c4695ce1"/>
     <w:p>
       <w:pPr>
         <w:pStyle w:val="Heading4"/>
@@ -18226,9 +18498,9 @@
         </w:pict>
       </w:r>
     </w:p>
-    <w:bookmarkEnd w:id="37"/>
     <w:bookmarkEnd w:id="38"/>
-    <w:bookmarkStart w:id="51" w:name="X3077a367f7be1b4761ca96ee83a509ba024c8b8"/>
+    <w:bookmarkEnd w:id="39"/>
+    <w:bookmarkStart w:id="52" w:name="X3077a367f7be1b4761ca96ee83a509ba024c8b8"/>
     <w:p>
       <w:pPr>
         <w:pStyle w:val="Heading3"/>
@@ -18326,7 +18598,7 @@
         <w:t xml:space="preserve">report (corpus root) on demand from live database state.</w:t>
       </w:r>
     </w:p>
-    <w:bookmarkStart w:id="39" w:name="layout-two-tab-card-grid"/>
+    <w:bookmarkStart w:id="40" w:name="layout-two-tab-card-grid"/>
     <w:p>
       <w:pPr>
         <w:pStyle w:val="Heading4"/>
@@ -18598,8 +18870,8 @@
         <w:t xml:space="preserve">sub-section so they don’t disrupt visual parity above.</w:t>
       </w:r>
     </w:p>
-    <w:bookmarkEnd w:id="39"/>
-    <w:bookmarkStart w:id="44" w:name="per-sku-settings-drawer"/>
+    <w:bookmarkEnd w:id="40"/>
+    <w:bookmarkStart w:id="45" w:name="per-sku-settings-drawer"/>
     <w:p>
       <w:pPr>
         <w:pStyle w:val="Heading4"/>
@@ -18616,7 +18888,7 @@
         <w:t xml:space="preserve">Click any tile → opens a right-side drawer (full height, 480 px wide) with 4 tabs:</w:t>
       </w:r>
     </w:p>
-    <w:bookmarkStart w:id="40" w:name="tab-1-eligibility"/>
+    <w:bookmarkStart w:id="41" w:name="tab-1-eligibility"/>
     <w:p>
       <w:pPr>
         <w:pStyle w:val="Heading5"/>
@@ -18835,8 +19107,8 @@
         <w:t xml:space="preserve">per the iteration 0023 § 2 audit pattern.</w:t>
       </w:r>
     </w:p>
-    <w:bookmarkEnd w:id="40"/>
-    <w:bookmarkStart w:id="41" w:name="tab-2-pricing"/>
+    <w:bookmarkEnd w:id="41"/>
+    <w:bookmarkStart w:id="42" w:name="tab-2-pricing"/>
     <w:p>
       <w:pPr>
         <w:pStyle w:val="Heading5"/>
@@ -19201,8 +19473,8 @@
         <w:t xml:space="preserve">with prior price · new price · prior frequency · new frequency · admin · reason · timestamp.</w:t>
       </w:r>
     </w:p>
-    <w:bookmarkEnd w:id="41"/>
-    <w:bookmarkStart w:id="42" w:name="tab-3-current-users"/>
+    <w:bookmarkEnd w:id="42"/>
+    <w:bookmarkStart w:id="43" w:name="tab-3-current-users"/>
     <w:p>
       <w:pPr>
         <w:pStyle w:val="Heading5"/>
@@ -19287,8 +19559,8 @@
         <w:t xml:space="preserve">For one-time SKUs (e.g., Papic 5-seat), shows lifetime purchases (one per event). For recurring SKUs (e.g., Vendor Pro Weekly), shows currently-active subscriptions only with a separate count for lifetime purchases.</w:t>
       </w:r>
     </w:p>
-    <w:bookmarkEnd w:id="42"/>
-    <w:bookmarkStart w:id="43" w:name="tab-4-statistics"/>
+    <w:bookmarkEnd w:id="43"/>
+    <w:bookmarkStart w:id="44" w:name="tab-4-statistics"/>
     <w:p>
       <w:pPr>
         <w:pStyle w:val="Heading5"/>
@@ -19676,9 +19948,9 @@
         <w:t xml:space="preserve">.</w:t>
       </w:r>
     </w:p>
-    <w:bookmarkEnd w:id="43"/>
     <w:bookmarkEnd w:id="44"/>
-    <w:bookmarkStart w:id="46" w:name="X98414b96873c8db6dfa6a21bbf3ac85e063f6a3"/>
+    <w:bookmarkEnd w:id="45"/>
+    <w:bookmarkStart w:id="47" w:name="X98414b96873c8db6dfa6a21bbf3ac85e063f6a3"/>
     <w:p>
       <w:pPr>
         <w:pStyle w:val="Heading4"/>
@@ -19794,7 +20066,7 @@
       <w:r>
         <w:t xml:space="preserve"> </w:t>
       </w:r>
-      <w:hyperlink r:id="rId45">
+      <w:hyperlink r:id="rId46">
         <w:r>
           <w:rPr>
             <w:rStyle w:val="Hyperlink"/>
@@ -19979,8 +20251,8 @@
         <w:t xml:space="preserve">The button is single-admin authority — generation is a read-only-from-DB operation, no state mutations. Only writes the report files.</w:t>
       </w:r>
     </w:p>
-    <w:bookmarkEnd w:id="46"/>
-    <w:bookmarkStart w:id="47" w:name="future-automation-v1.5-deferred"/>
+    <w:bookmarkEnd w:id="47"/>
+    <w:bookmarkStart w:id="48" w:name="future-automation-v1.5-deferred"/>
     <w:p>
       <w:pPr>
         <w:pStyle w:val="Heading4"/>
@@ -20174,8 +20446,8 @@
         <w:t xml:space="preserve">All four deferred to V1.5+; V1 ships with manual button-triggered regeneration.</w:t>
       </w:r>
     </w:p>
-    <w:bookmarkEnd w:id="47"/>
-    <w:bookmarkStart w:id="48" w:name="mobile-parity"/>
+    <w:bookmarkEnd w:id="48"/>
+    <w:bookmarkStart w:id="49" w:name="mobile-parity"/>
     <w:p>
       <w:pPr>
         <w:pStyle w:val="Heading4"/>
@@ -20192,8 +20464,8 @@
         <w:t xml:space="preserve">Card grid renders as 2-column on phone (1-column on narrow viewports). Drawer becomes a bottom sheet (full-height swipe-up) per the existing 0023 mobile pattern. All 4 tabs in the drawer remain accessible — no feature gating on mobile.</w:t>
       </w:r>
     </w:p>
-    <w:bookmarkEnd w:id="48"/>
-    <w:bookmarkStart w:id="49" w:name="schema-no-new-tables-leverages-existing"/>
+    <w:bookmarkEnd w:id="49"/>
+    <w:bookmarkStart w:id="50" w:name="schema-no-new-tables-leverages-existing"/>
     <w:p>
       <w:pPr>
         <w:pStyle w:val="Heading4"/>
@@ -20425,8 +20697,8 @@
         <w:t xml:space="preserve">) but no new DB tables.</w:t>
       </w:r>
     </w:p>
-    <w:bookmarkEnd w:id="49"/>
-    <w:bookmarkStart w:id="50" w:name="cross-references"/>
+    <w:bookmarkEnd w:id="50"/>
+    <w:bookmarkStart w:id="51" w:name="cross-references"/>
     <w:p>
       <w:pPr>
         <w:pStyle w:val="Heading4"/>
@@ -20635,7 +20907,7 @@
       <w:r>
         <w:t xml:space="preserve"> </w:t>
       </w:r>
-      <w:hyperlink r:id="rId45">
+      <w:hyperlink r:id="rId46">
         <w:r>
           <w:rPr>
             <w:rStyle w:val="VerbatimChar"/>
@@ -20657,9 +20929,9 @@
         </w:pict>
       </w:r>
     </w:p>
-    <w:bookmarkEnd w:id="50"/>
     <w:bookmarkEnd w:id="51"/>
-    <w:bookmarkStart w:id="59" w:name="X1c9fc3f178b58f11c75dbe413398c2545c9010a"/>
+    <w:bookmarkEnd w:id="52"/>
+    <w:bookmarkStart w:id="60" w:name="X1c9fc3f178b58f11c75dbe413398c2545c9010a"/>
     <w:p>
       <w:pPr>
         <w:pStyle w:val="Heading3"/>
@@ -20822,7 +21094,7 @@
         <w:t xml:space="preserve">) and hand-tweaks for accuracy / brand voice; hand-edits propagate to every future couple in that combination via the cache-forever architecture.</w:t>
       </w:r>
     </w:p>
-    <w:bookmarkStart w:id="52" w:name="X5aac32bc6ce7e9922bad979e1b29d680380cb3c"/>
+    <w:bookmarkStart w:id="53" w:name="X5aac32bc6ce7e9922bad979e1b29d680380cb3c"/>
     <w:p>
       <w:pPr>
         <w:pStyle w:val="Heading4"/>
@@ -21327,8 +21599,8 @@
         <w:t xml:space="preserve">(when a brain content audit is needed)</w:t>
       </w:r>
     </w:p>
-    <w:bookmarkEnd w:id="52"/>
-    <w:bookmarkStart w:id="53" w:name="b-subview-2-unanswered-questions-queue"/>
+    <w:bookmarkEnd w:id="53"/>
+    <w:bookmarkStart w:id="54" w:name="b-subview-2-unanswered-questions-queue"/>
     <w:p>
       <w:pPr>
         <w:pStyle w:val="Heading4"/>
@@ -21549,8 +21821,8 @@
         <w:t xml:space="preserve">Queue sorts by frequency descending — admin triages high-leverage chunks first.</w:t>
       </w:r>
     </w:p>
-    <w:bookmarkEnd w:id="53"/>
-    <w:bookmarkStart w:id="54" w:name="c-subview-3-concierge-cost-watch"/>
+    <w:bookmarkEnd w:id="54"/>
+    <w:bookmarkStart w:id="55" w:name="c-subview-3-concierge-cost-watch"/>
     <w:p>
       <w:pPr>
         <w:pStyle w:val="Heading4"/>
@@ -21669,8 +21941,8 @@
         <w:t xml:space="preserve">- Cache hit rate drops below 80% → admin investigates (likely brain edit invalidated too many cached responses; admin can do a planned regenerate sweep)</w:t>
       </w:r>
     </w:p>
-    <w:bookmarkEnd w:id="54"/>
-    <w:bookmarkStart w:id="55" w:name="d-subview-4-cowork-sync-lane"/>
+    <w:bookmarkEnd w:id="55"/>
+    <w:bookmarkStart w:id="56" w:name="d-subview-4-cowork-sync-lane"/>
     <w:p>
       <w:pPr>
         <w:pStyle w:val="Heading4"/>
@@ -21885,8 +22157,8 @@
         <w:t xml:space="preserve">workflow with inline diff comments back to Cowork. V1 ships approve / reject with text feedback.</w:t>
       </w:r>
     </w:p>
-    <w:bookmarkEnd w:id="55"/>
-    <w:bookmarkStart w:id="56" w:name="schema"/>
+    <w:bookmarkEnd w:id="56"/>
+    <w:bookmarkStart w:id="57" w:name="schema"/>
     <w:p>
       <w:pPr>
         <w:pStyle w:val="Heading4"/>
@@ -22062,8 +22334,8 @@
         <w:t xml:space="preserve">cowork_authored_by TEXT NULL · cowork_pending_review BOOLEAN NOT NULL DEFAULT FALSE</w:t>
       </w:r>
     </w:p>
-    <w:bookmarkEnd w:id="56"/>
-    <w:bookmarkStart w:id="57" w:name="mobile-placement"/>
+    <w:bookmarkEnd w:id="57"/>
+    <w:bookmarkStart w:id="58" w:name="mobile-placement"/>
     <w:p>
       <w:pPr>
         <w:pStyle w:val="Heading4"/>
@@ -22092,8 +22364,8 @@
         <w:t xml:space="preserve">tab on mobile (alongside Pricing, Disputes, Settings, Website editor, Concierge Abuse, Add-on Management). Mobile UI is read-only for content (admin reviews chunks on phone) — editing happens on desktop where the markdown editor + drawer fit.</w:t>
       </w:r>
     </w:p>
-    <w:bookmarkEnd w:id="57"/>
-    <w:bookmarkStart w:id="58" w:name="v1-vs-v1.5-scope"/>
+    <w:bookmarkEnd w:id="58"/>
+    <w:bookmarkStart w:id="59" w:name="v1-vs-v1.5-scope"/>
     <w:p>
       <w:pPr>
         <w:pStyle w:val="Heading4"/>
@@ -22187,9 +22459,9 @@
         </w:pict>
       </w:r>
     </w:p>
-    <w:bookmarkEnd w:id="58"/>
     <w:bookmarkEnd w:id="59"/>
-    <w:bookmarkStart w:id="60" w:name="X4aac9bb159c69783bbe0139d97fce0f9d406631"/>
+    <w:bookmarkEnd w:id="60"/>
+    <w:bookmarkStart w:id="61" w:name="X4aac9bb159c69783bbe0139d97fce0f9d406631"/>
     <w:p>
       <w:pPr>
         <w:pStyle w:val="Heading3"/>
@@ -23378,8 +23650,8 @@
         </w:pict>
       </w:r>
     </w:p>
-    <w:bookmarkEnd w:id="60"/>
-    <w:bookmarkStart w:id="62" w:name="X5a9d70cd3d7633d4aece050d7f43f8570ea8ae7"/>
+    <w:bookmarkEnd w:id="61"/>
+    <w:bookmarkStart w:id="63" w:name="X5a9d70cd3d7633d4aece050d7f43f8570ea8ae7"/>
     <w:p>
       <w:pPr>
         <w:pStyle w:val="Heading3"/>
@@ -23503,7 +23775,7 @@
       <w:r>
         <w:t xml:space="preserve"> </w:t>
       </w:r>
-      <w:hyperlink r:id="rId61">
+      <w:hyperlink r:id="rId62">
         <w:r>
           <w:rPr>
             <w:rStyle w:val="Hyperlink"/>
@@ -25489,7 +25761,7 @@
       <w:r>
         <w:t xml:space="preserve"> </w:t>
       </w:r>
-      <w:hyperlink r:id="rId10">
+      <w:hyperlink r:id="rId11">
         <w:r>
           <w:rPr>
             <w:rStyle w:val="Hyperlink"/>
@@ -27396,8 +27668,8 @@
         </w:pict>
       </w:r>
     </w:p>
-    <w:bookmarkEnd w:id="62"/>
-    <w:bookmarkStart w:id="63" w:name="X0283164adaba40b4a1953123c20b5d5e9d7a710"/>
+    <w:bookmarkEnd w:id="63"/>
+    <w:bookmarkStart w:id="64" w:name="X0283164adaba40b4a1953123c20b5d5e9d7a710"/>
     <w:p>
       <w:pPr>
         <w:pStyle w:val="Heading3"/>
@@ -28172,9 +28444,9 @@
         </w:pict>
       </w:r>
     </w:p>
-    <w:bookmarkEnd w:id="63"/>
     <w:bookmarkEnd w:id="64"/>
-    <w:bookmarkStart w:id="70" w:name="Xc7e30205e6be7ba74b71021e7544c0dc5649b69"/>
+    <w:bookmarkEnd w:id="65"/>
+    <w:bookmarkStart w:id="71" w:name="Xc7e30205e6be7ba74b71021e7544c0dc5649b69"/>
     <w:p>
       <w:pPr>
         <w:pStyle w:val="Heading2"/>
@@ -28219,7 +28491,7 @@
         <w:t xml:space="preserve">so the team can run the day-to-day at speed.</w:t>
       </w:r>
     </w:p>
-    <w:bookmarkStart w:id="65" w:name="mechanics"/>
+    <w:bookmarkStart w:id="66" w:name="mechanics"/>
     <w:p>
       <w:pPr>
         <w:pStyle w:val="Heading3"/>
@@ -28488,8 +28760,8 @@
         <w:t xml:space="preserve">audit tag. Single-use; no further exceptions after the second admin exists.</w:t>
       </w:r>
     </w:p>
-    <w:bookmarkEnd w:id="65"/>
-    <w:bookmarkStart w:id="66" w:name="required-for-the-major-decisions-list"/>
+    <w:bookmarkEnd w:id="66"/>
+    <w:bookmarkStart w:id="67" w:name="required-for-the-major-decisions-list"/>
     <w:p>
       <w:pPr>
         <w:pStyle w:val="Heading3"/>
@@ -28870,8 +29142,8 @@
         </w:tc>
       </w:tr>
     </w:tbl>
-    <w:bookmarkEnd w:id="66"/>
-    <w:bookmarkStart w:id="67" w:name="X754d6eede66ea75fcf8256626c58de509bb89e6"/>
+    <w:bookmarkEnd w:id="67"/>
+    <w:bookmarkStart w:id="68" w:name="X754d6eede66ea75fcf8256626c58de509bb89e6"/>
     <w:p>
       <w:pPr>
         <w:pStyle w:val="Heading3"/>
@@ -29222,8 +29494,8 @@
         </w:tc>
       </w:tr>
     </w:tbl>
-    <w:bookmarkEnd w:id="67"/>
-    <w:bookmarkStart w:id="68" w:name="why-this-scope-is-right-for-v1"/>
+    <w:bookmarkEnd w:id="68"/>
+    <w:bookmarkStart w:id="69" w:name="why-this-scope-is-right-for-v1"/>
     <w:p>
       <w:pPr>
         <w:pStyle w:val="Heading3"/>
@@ -29335,8 +29607,8 @@
         <w:t xml:space="preserve">New admin promotions, internal-account creation, payment-account changes, mid-quarter pricing moves happen weekly or less — friction is a feature, not a bug, on those.</w:t>
       </w:r>
     </w:p>
-    <w:bookmarkEnd w:id="68"/>
-    <w:bookmarkStart w:id="69" w:name="schema-1"/>
+    <w:bookmarkEnd w:id="69"/>
+    <w:bookmarkStart w:id="70" w:name="schema-1"/>
     <w:p>
       <w:pPr>
         <w:pStyle w:val="Heading3"/>
@@ -30104,9 +30376,9 @@
         </w:pict>
       </w:r>
     </w:p>
-    <w:bookmarkEnd w:id="69"/>
     <w:bookmarkEnd w:id="70"/>
-    <w:bookmarkStart w:id="71" w:name="mobile-vital-info-rule-inherited"/>
+    <w:bookmarkEnd w:id="71"/>
+    <w:bookmarkStart w:id="72" w:name="mobile-vital-info-rule-inherited"/>
     <w:p>
       <w:pPr>
         <w:pStyle w:val="Heading2"/>
@@ -30191,8 +30463,8 @@
         </w:pict>
       </w:r>
     </w:p>
-    <w:bookmarkEnd w:id="71"/>
-    <w:bookmarkStart w:id="72" w:name="cross-iteration-handoffs"/>
+    <w:bookmarkEnd w:id="72"/>
+    <w:bookmarkStart w:id="73" w:name="cross-iteration-handoffs"/>
     <w:p>
       <w:pPr>
         <w:pStyle w:val="Heading2"/>
@@ -30362,8 +30634,8 @@
         </w:pict>
       </w:r>
     </w:p>
-    <w:bookmarkEnd w:id="72"/>
-    <w:bookmarkStart w:id="73" w:name="Xd4881637e7acba4a4ba0743ec8ee3c62da9c61c"/>
+    <w:bookmarkEnd w:id="73"/>
+    <w:bookmarkStart w:id="74" w:name="Xd4881637e7acba4a4ba0743ec8ee3c62da9c61c"/>
     <w:p>
       <w:pPr>
         <w:pStyle w:val="Heading2"/>
@@ -31001,8 +31273,8 @@
         </w:pict>
       </w:r>
     </w:p>
-    <w:bookmarkEnd w:id="73"/>
-    <w:bookmarkStart w:id="74" w:name="companions-and-next-steps"/>
+    <w:bookmarkEnd w:id="74"/>
+    <w:bookmarkStart w:id="75" w:name="companions-and-next-steps"/>
     <w:p>
       <w:pPr>
         <w:pStyle w:val="Heading2"/>
@@ -31065,8 +31337,8 @@
         <w:t xml:space="preserve">The admin console is operationally critical for Setnayan launch · ships alongside 0015 (marketing site)</w:t>
       </w:r>
     </w:p>
-    <w:bookmarkEnd w:id="74"/>
     <w:bookmarkEnd w:id="75"/>
+    <w:bookmarkEnd w:id="76"/>
     <w:sectPr>
       <w:footnotePr>
         <w:numRestart w:val="eachSect"/>

</xml_diff>